<commit_message>
Enable resource item detail page route
Re-enables the `resources/item/<int:pk>/` URL and adds a working `resource_detail` view that fetches a `ResourceItem` and renders `resources/resource_detail.html`. This restores direct access to individual resource pages from the resources section. The taxonomy hierarchy DOCX was also updated.
</commit_message>
<xml_diff>
--- a/main/static/documents/AMRx_Hub_Taxonomy_System_Hierarchy_v0.5.0.docx
+++ b/main/static/documents/AMRx_Hub_Taxonomy_System_Hierarchy_v0.5.0.docx
@@ -846,6 +846,7 @@
     <w:p>
       <w:pPr>
         <w:numPr>
+          <w:ilvl w:val="0"/>
           <w:numId w:val="0"/>
         </w:numPr>
         <w:spacing w:line="360" w:lineRule="auto"/>
@@ -1056,15 +1057,15 @@
           <w:sz w:val="24"/>
           <w:szCs w:val="24"/>
         </w:rPr>
-        <w:t>Order</w:t>
-      </w:r>
-      <w:r>
-        <w:rPr>
-          <w:rFonts w:hint="default" w:ascii="Times New Roman" w:hAnsi="Times New Roman" w:cs="Times New Roman"/>
-          <w:sz w:val="24"/>
-          <w:szCs w:val="24"/>
-        </w:rPr>
-        <w:t>. Controls the order in which categories/tools are displayed.</w:t>
+        <w:t>Category Type</w:t>
+      </w:r>
+      <w:r>
+        <w:rPr>
+          <w:rFonts w:hint="default" w:ascii="Times New Roman" w:hAnsi="Times New Roman" w:cs="Times New Roman"/>
+          <w:sz w:val="24"/>
+          <w:szCs w:val="24"/>
+        </w:rPr>
+        <w:t>. Identifies the category as Organisms Specific or General Use.</w:t>
       </w:r>
     </w:p>
     <w:p>
@@ -1092,15 +1093,15 @@
           <w:sz w:val="24"/>
           <w:szCs w:val="24"/>
         </w:rPr>
-        <w:t>Is Active</w:t>
-      </w:r>
-      <w:r>
-        <w:rPr>
-          <w:rFonts w:hint="default" w:ascii="Times New Roman" w:hAnsi="Times New Roman" w:cs="Times New Roman"/>
-          <w:sz w:val="24"/>
-          <w:szCs w:val="24"/>
-        </w:rPr>
-        <w:t>. Controls whether the category is visible to users.</w:t>
+        <w:t>Icon</w:t>
+      </w:r>
+      <w:r>
+        <w:rPr>
+          <w:rFonts w:hint="default" w:ascii="Times New Roman" w:hAnsi="Times New Roman" w:cs="Times New Roman"/>
+          <w:sz w:val="24"/>
+          <w:szCs w:val="24"/>
+        </w:rPr>
+        <w:t>. A visual representation used for the category.</w:t>
       </w:r>
     </w:p>
     <w:p>
@@ -1126,15 +1127,77 @@
           <w:sz w:val="24"/>
           <w:szCs w:val="24"/>
         </w:rPr>
-        <w:t>Category Type</w:t>
-      </w:r>
-      <w:r>
-        <w:rPr>
-          <w:rFonts w:hint="default" w:ascii="Times New Roman" w:hAnsi="Times New Roman" w:cs="Times New Roman"/>
-          <w:sz w:val="24"/>
-          <w:szCs w:val="24"/>
-        </w:rPr>
-        <w:t>. Identifies the category as Organisms Specific or General Use.</w:t>
+        <w:t>Color</w:t>
+      </w:r>
+      <w:r>
+        <w:rPr>
+          <w:rFonts w:hint="default" w:ascii="Times New Roman" w:hAnsi="Times New Roman" w:cs="Times New Roman"/>
+          <w:sz w:val="24"/>
+          <w:szCs w:val="24"/>
+        </w:rPr>
+        <w:t>. A category-associated display color. For organism categories it may reflect the established visual convention used by AMRx Hub; for General Use categories it should communicate the function appropriately.</w:t>
+      </w:r>
+    </w:p>
+    <w:p>
+      <w:pPr>
+        <w:numPr>
+          <w:numId w:val="0"/>
+        </w:numPr>
+        <w:tabs>
+          <w:tab w:val="left" w:pos="425"/>
+        </w:tabs>
+        <w:spacing w:after="200" w:line="360" w:lineRule="auto"/>
+        <w:jc w:val="both"/>
+        <w:rPr>
+          <w:rFonts w:hint="default" w:ascii="Times New Roman" w:hAnsi="Times New Roman" w:cs="Times New Roman"/>
+          <w:b/>
+          <w:bCs/>
+          <w:sz w:val="24"/>
+          <w:szCs w:val="24"/>
+          <w:lang w:val="en-US"/>
+        </w:rPr>
+      </w:pPr>
+      <w:r>
+        <w:rPr>
+          <w:rFonts w:hint="default" w:ascii="Times New Roman" w:hAnsi="Times New Roman" w:cs="Times New Roman"/>
+          <w:b/>
+          <w:bCs/>
+          <w:sz w:val="24"/>
+          <w:szCs w:val="24"/>
+        </w:rPr>
+        <w:t>Administrative</w:t>
+      </w:r>
+      <w:r>
+        <w:rPr>
+          <w:rFonts w:hint="default" w:ascii="Times New Roman" w:hAnsi="Times New Roman" w:cs="Times New Roman"/>
+          <w:b/>
+          <w:bCs/>
+          <w:sz w:val="24"/>
+          <w:szCs w:val="24"/>
+          <w:lang w:val="en-US"/>
+        </w:rPr>
+        <w:t xml:space="preserve"> </w:t>
+      </w:r>
+      <w:r>
+        <w:rPr>
+          <w:rFonts w:hint="default" w:ascii="Times New Roman" w:hAnsi="Times New Roman" w:cs="Times New Roman"/>
+          <w:b/>
+          <w:bCs/>
+          <w:sz w:val="24"/>
+          <w:szCs w:val="24"/>
+        </w:rPr>
+        <w:t>Category Metadata</w:t>
+      </w:r>
+      <w:r>
+        <w:rPr>
+          <w:rFonts w:hint="default" w:ascii="Times New Roman" w:hAnsi="Times New Roman" w:cs="Times New Roman"/>
+          <w:b/>
+          <w:bCs/>
+          <w:sz w:val="24"/>
+          <w:szCs w:val="24"/>
+          <w:lang w:val="en-US"/>
+        </w:rPr>
+        <w:t xml:space="preserve"> for Tools</w:t>
       </w:r>
     </w:p>
     <w:p>
@@ -1157,20 +1220,18 @@
           <w:rFonts w:hint="default" w:ascii="Times New Roman" w:hAnsi="Times New Roman" w:cs="Times New Roman"/>
           <w:b/>
           <w:bCs/>
-          <w:i w:val="0"/>
-          <w:iCs w:val="0"/>
-          <w:sz w:val="24"/>
-          <w:szCs w:val="24"/>
-        </w:rPr>
-        <w:t>Icon</w:t>
-      </w:r>
-      <w:r>
-        <w:rPr>
-          <w:rFonts w:hint="default" w:ascii="Times New Roman" w:hAnsi="Times New Roman" w:cs="Times New Roman"/>
-          <w:sz w:val="24"/>
-          <w:szCs w:val="24"/>
-        </w:rPr>
-        <w:t>. A visual representation used for the category.</w:t>
+          <w:sz w:val="24"/>
+          <w:szCs w:val="24"/>
+        </w:rPr>
+        <w:t>Order</w:t>
+      </w:r>
+      <w:r>
+        <w:rPr>
+          <w:rFonts w:hint="default" w:ascii="Times New Roman" w:hAnsi="Times New Roman" w:cs="Times New Roman"/>
+          <w:sz w:val="24"/>
+          <w:szCs w:val="24"/>
+        </w:rPr>
+        <w:t>. Controls the order in which categories/tools are displayed.</w:t>
       </w:r>
     </w:p>
     <w:p>
@@ -1193,19 +1254,41 @@
           <w:rFonts w:hint="default" w:ascii="Times New Roman" w:hAnsi="Times New Roman" w:cs="Times New Roman"/>
           <w:b/>
           <w:bCs/>
-          <w:sz w:val="24"/>
-          <w:szCs w:val="24"/>
-        </w:rPr>
-        <w:t>Color</w:t>
-      </w:r>
-      <w:r>
-        <w:rPr>
-          <w:rFonts w:hint="default" w:ascii="Times New Roman" w:hAnsi="Times New Roman" w:cs="Times New Roman"/>
-          <w:sz w:val="24"/>
-          <w:szCs w:val="24"/>
-        </w:rPr>
-        <w:t>. A category-associated display color. For organism categories it may reflect the established visual convention used by AMRx Hub; for General Use categories it should communicate the function appropriately.</w:t>
-      </w:r>
+          <w:i w:val="0"/>
+          <w:iCs w:val="0"/>
+          <w:sz w:val="24"/>
+          <w:szCs w:val="24"/>
+        </w:rPr>
+        <w:t>Is Active</w:t>
+      </w:r>
+      <w:r>
+        <w:rPr>
+          <w:rFonts w:hint="default" w:ascii="Times New Roman" w:hAnsi="Times New Roman" w:cs="Times New Roman"/>
+          <w:sz w:val="24"/>
+          <w:szCs w:val="24"/>
+        </w:rPr>
+        <w:t>. Controls whether the category is visible to users.</w:t>
+      </w:r>
+    </w:p>
+    <w:p>
+      <w:pPr>
+        <w:numPr>
+          <w:numId w:val="0"/>
+        </w:numPr>
+        <w:tabs>
+          <w:tab w:val="left" w:pos="425"/>
+        </w:tabs>
+        <w:spacing w:after="200" w:line="360" w:lineRule="auto"/>
+        <w:jc w:val="both"/>
+        <w:rPr>
+          <w:rFonts w:hint="default" w:ascii="Times New Roman" w:hAnsi="Times New Roman" w:cs="Times New Roman"/>
+          <w:b/>
+          <w:bCs/>
+          <w:sz w:val="24"/>
+          <w:szCs w:val="24"/>
+          <w:lang w:val="en-US"/>
+        </w:rPr>
+      </w:pPr>
     </w:p>
     <w:p>
       <w:pPr>
@@ -1735,6 +1818,7 @@
           <w:bCs/>
           <w:sz w:val="24"/>
           <w:szCs w:val="24"/>
+          <w:lang w:val="en-US"/>
         </w:rPr>
       </w:pPr>
       <w:r>
@@ -1745,26 +1829,177 @@
           <w:sz w:val="24"/>
           <w:szCs w:val="24"/>
         </w:rPr>
-        <w:t>4.3 Meaning of Tool Type</w:t>
+        <w:t>Administrative Metadata</w:t>
+      </w:r>
+      <w:r>
+        <w:rPr>
+          <w:rFonts w:hint="default" w:ascii="Times New Roman" w:hAnsi="Times New Roman" w:cs="Times New Roman"/>
+          <w:b/>
+          <w:bCs/>
+          <w:sz w:val="24"/>
+          <w:szCs w:val="24"/>
+          <w:lang w:val="en-US"/>
+        </w:rPr>
+        <w:t xml:space="preserve"> for Tools</w:t>
       </w:r>
     </w:p>
     <w:p>
       <w:pPr>
+        <w:numPr>
+          <w:ilvl w:val="0"/>
+          <w:numId w:val="9"/>
+        </w:numPr>
+        <w:spacing w:line="360" w:lineRule="auto"/>
+        <w:ind w:left="425" w:leftChars="0" w:hanging="425" w:firstLineChars="0"/>
+        <w:jc w:val="both"/>
+        <w:rPr>
+          <w:rFonts w:hint="default" w:ascii="Times New Roman" w:hAnsi="Times New Roman" w:cs="Times New Roman"/>
+          <w:sz w:val="24"/>
+          <w:szCs w:val="24"/>
+        </w:rPr>
+      </w:pPr>
+      <w:r>
+        <w:rPr>
+          <w:rFonts w:hint="default" w:ascii="Times New Roman" w:hAnsi="Times New Roman" w:cs="Times New Roman"/>
+          <w:b/>
+          <w:bCs/>
+          <w:sz w:val="24"/>
+          <w:szCs w:val="24"/>
+        </w:rPr>
+        <w:t>Approval Status</w:t>
+      </w:r>
+      <w:r>
+        <w:rPr>
+          <w:rFonts w:hint="default" w:ascii="Times New Roman" w:hAnsi="Times New Roman" w:cs="Times New Roman"/>
+          <w:sz w:val="24"/>
+          <w:szCs w:val="24"/>
+        </w:rPr>
+        <w:t>. Indicates whether an item is Pending Review, Approved, or Rejected.</w:t>
+      </w:r>
+    </w:p>
+    <w:p>
+      <w:pPr>
+        <w:numPr>
+          <w:ilvl w:val="0"/>
+          <w:numId w:val="9"/>
+        </w:numPr>
+        <w:spacing w:line="360" w:lineRule="auto"/>
+        <w:ind w:left="425" w:leftChars="0" w:hanging="425" w:firstLineChars="0"/>
+        <w:jc w:val="both"/>
+        <w:rPr>
+          <w:rFonts w:hint="default" w:ascii="Times New Roman" w:hAnsi="Times New Roman" w:cs="Times New Roman"/>
+          <w:sz w:val="24"/>
+          <w:szCs w:val="24"/>
+        </w:rPr>
+      </w:pPr>
+      <w:r>
+        <w:rPr>
+          <w:rFonts w:hint="default" w:ascii="Times New Roman" w:hAnsi="Times New Roman" w:cs="Times New Roman"/>
+          <w:b/>
+          <w:bCs/>
+          <w:sz w:val="24"/>
+          <w:szCs w:val="24"/>
+        </w:rPr>
+        <w:t>Rejection Reason</w:t>
+      </w:r>
+      <w:r>
+        <w:rPr>
+          <w:rFonts w:hint="default" w:ascii="Times New Roman" w:hAnsi="Times New Roman" w:cs="Times New Roman"/>
+          <w:sz w:val="24"/>
+          <w:szCs w:val="24"/>
+        </w:rPr>
+        <w:t>. Records why an item was rejected or why further review is required.</w:t>
+      </w:r>
+    </w:p>
+    <w:p>
+      <w:pPr>
+        <w:numPr>
+          <w:ilvl w:val="0"/>
+          <w:numId w:val="9"/>
+        </w:numPr>
+        <w:spacing w:line="360" w:lineRule="auto"/>
+        <w:ind w:left="425" w:leftChars="0" w:hanging="425" w:firstLineChars="0"/>
+        <w:jc w:val="both"/>
+        <w:rPr>
+          <w:rFonts w:hint="default" w:ascii="Times New Roman" w:hAnsi="Times New Roman" w:cs="Times New Roman"/>
+          <w:sz w:val="24"/>
+          <w:szCs w:val="24"/>
+        </w:rPr>
+      </w:pPr>
+      <w:r>
+        <w:rPr>
+          <w:rFonts w:hint="default" w:ascii="Times New Roman" w:hAnsi="Times New Roman" w:cs="Times New Roman"/>
+          <w:b/>
+          <w:bCs/>
+          <w:sz w:val="24"/>
+          <w:szCs w:val="24"/>
+        </w:rPr>
+        <w:t>Is Featured</w:t>
+      </w:r>
+      <w:r>
+        <w:rPr>
+          <w:rFonts w:hint="default" w:ascii="Times New Roman" w:hAnsi="Times New Roman" w:cs="Times New Roman"/>
+          <w:sz w:val="24"/>
+          <w:szCs w:val="24"/>
+        </w:rPr>
+        <w:t>. A controlled platform-promotion status used to place a selected tool/resource in a prominent position for a defined period. Commercial arrangements and advertising policy are outside the taxonomy specification.</w:t>
+      </w:r>
+    </w:p>
+    <w:p>
+      <w:pPr>
+        <w:numPr>
+          <w:ilvl w:val="0"/>
+          <w:numId w:val="9"/>
+        </w:numPr>
+        <w:spacing w:line="360" w:lineRule="auto"/>
+        <w:ind w:left="425" w:leftChars="0" w:hanging="425" w:firstLineChars="0"/>
+        <w:jc w:val="both"/>
+        <w:rPr>
+          <w:rFonts w:hint="default" w:ascii="Times New Roman" w:hAnsi="Times New Roman" w:cs="Times New Roman"/>
+          <w:sz w:val="24"/>
+          <w:szCs w:val="24"/>
+        </w:rPr>
+      </w:pPr>
+      <w:r>
+        <w:rPr>
+          <w:rFonts w:hint="default" w:ascii="Times New Roman" w:hAnsi="Times New Roman" w:cs="Times New Roman"/>
+          <w:b/>
+          <w:bCs/>
+          <w:sz w:val="24"/>
+          <w:szCs w:val="24"/>
+        </w:rPr>
+        <w:t>Is Active</w:t>
+      </w:r>
+      <w:r>
+        <w:rPr>
+          <w:rFonts w:hint="default" w:ascii="Times New Roman" w:hAnsi="Times New Roman" w:cs="Times New Roman"/>
+          <w:sz w:val="24"/>
+          <w:szCs w:val="24"/>
+        </w:rPr>
+        <w:t>. Controls whether an approved tool/resource is visible to users.</w:t>
+      </w:r>
+    </w:p>
+    <w:p>
+      <w:pPr>
         <w:spacing w:line="360" w:lineRule="auto"/>
         <w:jc w:val="both"/>
         <w:rPr>
           <w:rFonts w:hint="default" w:ascii="Times New Roman" w:hAnsi="Times New Roman" w:cs="Times New Roman"/>
-          <w:sz w:val="24"/>
-          <w:szCs w:val="24"/>
-        </w:rPr>
-      </w:pPr>
-      <w:r>
-        <w:rPr>
-          <w:rFonts w:hint="default" w:ascii="Times New Roman" w:hAnsi="Times New Roman" w:cs="Times New Roman"/>
-          <w:sz w:val="24"/>
-          <w:szCs w:val="24"/>
-        </w:rPr>
-        <w:t>Tool Type distinguishes the delivery or operational form of a tool/resource. Database/Resource is retained within Tool Type specifically for databases or resource platforms that provide an interactive computational function. It does not mean that every static resource belongs in the Tools section.</w:t>
+          <w:b/>
+          <w:bCs/>
+          <w:sz w:val="24"/>
+          <w:szCs w:val="24"/>
+        </w:rPr>
+      </w:pPr>
+      <w:r>
+        <w:rPr>
+          <w:rFonts w:hint="default" w:ascii="Times New Roman" w:hAnsi="Times New Roman" w:cs="Times New Roman"/>
+          <w:b/>
+          <w:bCs/>
+          <w:sz w:val="24"/>
+          <w:szCs w:val="24"/>
+        </w:rPr>
+        <w:t>4.3 Meaning of Tool Type</w:t>
       </w:r>
     </w:p>
     <w:p>
@@ -1773,6 +2008,25 @@
         <w:jc w:val="both"/>
         <w:rPr>
           <w:rFonts w:hint="default" w:ascii="Times New Roman" w:hAnsi="Times New Roman" w:cs="Times New Roman"/>
+          <w:sz w:val="24"/>
+          <w:szCs w:val="24"/>
+        </w:rPr>
+      </w:pPr>
+      <w:r>
+        <w:rPr>
+          <w:rFonts w:hint="default" w:ascii="Times New Roman" w:hAnsi="Times New Roman" w:cs="Times New Roman"/>
+          <w:sz w:val="24"/>
+          <w:szCs w:val="24"/>
+        </w:rPr>
+        <w:t>Tool Type distinguishes the delivery or operational form of a tool/resource. Database/Resource is retained within Tool Type specifically for databases or resource platforms that provide an interactive computational function. It does not mean that every static resource belongs in the Tools section.</w:t>
+      </w:r>
+    </w:p>
+    <w:p>
+      <w:pPr>
+        <w:spacing w:line="360" w:lineRule="auto"/>
+        <w:jc w:val="both"/>
+        <w:rPr>
+          <w:rFonts w:hint="default" w:ascii="Times New Roman" w:hAnsi="Times New Roman" w:cs="Times New Roman"/>
           <w:b/>
           <w:bCs/>
           <w:sz w:val="24"/>
@@ -1787,7 +2041,28 @@
           <w:sz w:val="24"/>
           <w:szCs w:val="24"/>
         </w:rPr>
-        <w:t>4.4 Administrative Metadata</w:t>
+        <w:t>4.</w:t>
+      </w:r>
+      <w:r>
+        <w:rPr>
+          <w:rFonts w:hint="default" w:ascii="Times New Roman" w:hAnsi="Times New Roman" w:cs="Times New Roman"/>
+          <w:b/>
+          <w:bCs/>
+          <w:sz w:val="24"/>
+          <w:szCs w:val="24"/>
+          <w:lang w:val="en-US"/>
+        </w:rPr>
+        <w:t>4</w:t>
+      </w:r>
+      <w:r>
+        <w:rPr>
+          <w:rFonts w:hint="default" w:ascii="Times New Roman" w:hAnsi="Times New Roman" w:cs="Times New Roman"/>
+          <w:b/>
+          <w:bCs/>
+          <w:sz w:val="24"/>
+          <w:szCs w:val="24"/>
+        </w:rPr>
+        <w:t xml:space="preserve"> Resource Category Metadata</w:t>
       </w:r>
     </w:p>
     <w:p>
@@ -1813,15 +2088,15 @@
           <w:sz w:val="24"/>
           <w:szCs w:val="24"/>
         </w:rPr>
-        <w:t>Approval Status</w:t>
-      </w:r>
-      <w:r>
-        <w:rPr>
-          <w:rFonts w:hint="default" w:ascii="Times New Roman" w:hAnsi="Times New Roman" w:cs="Times New Roman"/>
-          <w:sz w:val="24"/>
-          <w:szCs w:val="24"/>
-        </w:rPr>
-        <w:t>. Indicates whether an item is Pending Review, Approved, or Rejected.</w:t>
+        <w:t>Name</w:t>
+      </w:r>
+      <w:r>
+        <w:rPr>
+          <w:rFonts w:hint="default" w:ascii="Times New Roman" w:hAnsi="Times New Roman" w:cs="Times New Roman"/>
+          <w:sz w:val="24"/>
+          <w:szCs w:val="24"/>
+        </w:rPr>
+        <w:t>. The name of the resource category.</w:t>
       </w:r>
     </w:p>
     <w:p>
@@ -1847,15 +2122,15 @@
           <w:sz w:val="24"/>
           <w:szCs w:val="24"/>
         </w:rPr>
-        <w:t>Rejection Reason</w:t>
-      </w:r>
-      <w:r>
-        <w:rPr>
-          <w:rFonts w:hint="default" w:ascii="Times New Roman" w:hAnsi="Times New Roman" w:cs="Times New Roman"/>
-          <w:sz w:val="24"/>
-          <w:szCs w:val="24"/>
-        </w:rPr>
-        <w:t>. Records why an item was rejected or why further review is required.</w:t>
+        <w:t>Icon</w:t>
+      </w:r>
+      <w:r>
+        <w:rPr>
+          <w:rFonts w:hint="default" w:ascii="Times New Roman" w:hAnsi="Times New Roman" w:cs="Times New Roman"/>
+          <w:sz w:val="24"/>
+          <w:szCs w:val="24"/>
+        </w:rPr>
+        <w:t>. A visual representation of the resource category.</w:t>
       </w:r>
     </w:p>
     <w:p>
@@ -1881,15 +2156,42 @@
           <w:sz w:val="24"/>
           <w:szCs w:val="24"/>
         </w:rPr>
-        <w:t>Is Featured</w:t>
-      </w:r>
-      <w:r>
-        <w:rPr>
-          <w:rFonts w:hint="default" w:ascii="Times New Roman" w:hAnsi="Times New Roman" w:cs="Times New Roman"/>
-          <w:sz w:val="24"/>
-          <w:szCs w:val="24"/>
-        </w:rPr>
-        <w:t>. A controlled platform-promotion status used to place a selected tool/resource in a prominent position for a defined period. Commercial arrangements and advertising policy are outside the taxonomy specification.</w:t>
+        <w:t>Description</w:t>
+      </w:r>
+      <w:r>
+        <w:rPr>
+          <w:rFonts w:hint="default" w:ascii="Times New Roman" w:hAnsi="Times New Roman" w:cs="Times New Roman"/>
+          <w:sz w:val="24"/>
+          <w:szCs w:val="24"/>
+        </w:rPr>
+        <w:t>. A description explaining the category.</w:t>
+      </w:r>
+    </w:p>
+    <w:p>
+      <w:pPr>
+        <w:numPr>
+          <w:numId w:val="0"/>
+        </w:numPr>
+        <w:tabs>
+          <w:tab w:val="left" w:pos="425"/>
+        </w:tabs>
+        <w:spacing w:after="200" w:line="360" w:lineRule="auto"/>
+        <w:jc w:val="both"/>
+        <w:rPr>
+          <w:rFonts w:hint="default" w:ascii="Times New Roman" w:hAnsi="Times New Roman" w:cs="Times New Roman"/>
+          <w:sz w:val="24"/>
+          <w:szCs w:val="24"/>
+        </w:rPr>
+      </w:pPr>
+      <w:r>
+        <w:rPr>
+          <w:rFonts w:hint="default" w:ascii="Times New Roman" w:hAnsi="Times New Roman" w:cs="Times New Roman"/>
+          <w:b/>
+          <w:bCs/>
+          <w:sz w:val="24"/>
+          <w:szCs w:val="24"/>
+        </w:rPr>
+        <w:t>Administrative Resource Category Metadata</w:t>
       </w:r>
     </w:p>
     <w:p>
@@ -1914,6 +2216,7 @@
           <w:bCs/>
           <w:sz w:val="24"/>
           <w:szCs w:val="24"/>
+          <w:lang w:val="en-US"/>
         </w:rPr>
         <w:t>Is Active</w:t>
       </w:r>
@@ -1922,8 +2225,17 @@
           <w:rFonts w:hint="default" w:ascii="Times New Roman" w:hAnsi="Times New Roman" w:cs="Times New Roman"/>
           <w:sz w:val="24"/>
           <w:szCs w:val="24"/>
-        </w:rPr>
-        <w:t>. Controls whether an approved tool/resource is visible to users.</w:t>
+          <w:lang w:val="en-US"/>
+        </w:rPr>
+        <w:t>.</w:t>
+      </w:r>
+      <w:r>
+        <w:rPr>
+          <w:rFonts w:hint="default" w:ascii="Times New Roman" w:hAnsi="Times New Roman" w:cs="Times New Roman"/>
+          <w:sz w:val="24"/>
+          <w:szCs w:val="24"/>
+        </w:rPr>
+        <w:t xml:space="preserve"> Controls whether an approved tool/resource is visible to users.</w:t>
       </w:r>
     </w:p>
     <w:p>
@@ -1946,7 +2258,49 @@
           <w:sz w:val="24"/>
           <w:szCs w:val="24"/>
         </w:rPr>
-        <w:t>4.5 Resource Category Metadata</w:t>
+        <w:t>4.</w:t>
+      </w:r>
+      <w:r>
+        <w:rPr>
+          <w:rFonts w:hint="default" w:ascii="Times New Roman" w:hAnsi="Times New Roman" w:cs="Times New Roman"/>
+          <w:b/>
+          <w:bCs/>
+          <w:sz w:val="24"/>
+          <w:szCs w:val="24"/>
+          <w:lang w:val="en-US"/>
+        </w:rPr>
+        <w:t>5</w:t>
+      </w:r>
+      <w:r>
+        <w:rPr>
+          <w:rFonts w:hint="default" w:ascii="Times New Roman" w:hAnsi="Times New Roman" w:cs="Times New Roman"/>
+          <w:b/>
+          <w:bCs/>
+          <w:sz w:val="24"/>
+          <w:szCs w:val="24"/>
+        </w:rPr>
+        <w:t xml:space="preserve"> Metadata for Individual</w:t>
+      </w:r>
+      <w:r>
+        <w:rPr>
+          <w:rFonts w:hint="default" w:ascii="Times New Roman" w:hAnsi="Times New Roman" w:cs="Times New Roman"/>
+          <w:b/>
+          <w:bCs/>
+          <w:sz w:val="24"/>
+          <w:szCs w:val="24"/>
+          <w:lang w:val="en-US"/>
+        </w:rPr>
+        <w:t xml:space="preserve"> </w:t>
+      </w:r>
+      <w:r>
+        <w:rPr>
+          <w:rFonts w:hint="default" w:ascii="Times New Roman" w:hAnsi="Times New Roman" w:cs="Times New Roman"/>
+          <w:b/>
+          <w:bCs/>
+          <w:sz w:val="24"/>
+          <w:szCs w:val="24"/>
+        </w:rPr>
+        <w:t>Resource Item</w:t>
       </w:r>
     </w:p>
     <w:p>
@@ -1972,15 +2326,15 @@
           <w:sz w:val="24"/>
           <w:szCs w:val="24"/>
         </w:rPr>
-        <w:t>Name</w:t>
-      </w:r>
-      <w:r>
-        <w:rPr>
-          <w:rFonts w:hint="default" w:ascii="Times New Roman" w:hAnsi="Times New Roman" w:cs="Times New Roman"/>
-          <w:sz w:val="24"/>
-          <w:szCs w:val="24"/>
-        </w:rPr>
-        <w:t>. The name of the resource category.</w:t>
+        <w:t>Category</w:t>
+      </w:r>
+      <w:r>
+        <w:rPr>
+          <w:rFonts w:hint="default" w:ascii="Times New Roman" w:hAnsi="Times New Roman" w:cs="Times New Roman"/>
+          <w:sz w:val="24"/>
+          <w:szCs w:val="24"/>
+        </w:rPr>
+        <w:t>. The resource category in which the item is placed.</w:t>
       </w:r>
     </w:p>
     <w:p>
@@ -2006,15 +2360,15 @@
           <w:sz w:val="24"/>
           <w:szCs w:val="24"/>
         </w:rPr>
-        <w:t>Icon</w:t>
-      </w:r>
-      <w:r>
-        <w:rPr>
-          <w:rFonts w:hint="default" w:ascii="Times New Roman" w:hAnsi="Times New Roman" w:cs="Times New Roman"/>
-          <w:sz w:val="24"/>
-          <w:szCs w:val="24"/>
-        </w:rPr>
-        <w:t>. A visual representation of the resource category.</w:t>
+        <w:t>Title</w:t>
+      </w:r>
+      <w:r>
+        <w:rPr>
+          <w:rFonts w:hint="default" w:ascii="Times New Roman" w:hAnsi="Times New Roman" w:cs="Times New Roman"/>
+          <w:sz w:val="24"/>
+          <w:szCs w:val="24"/>
+        </w:rPr>
+        <w:t>. The name/title of the resource.</w:t>
       </w:r>
     </w:p>
     <w:p>
@@ -2048,11 +2402,517 @@
           <w:sz w:val="24"/>
           <w:szCs w:val="24"/>
         </w:rPr>
-        <w:t>. A description explaining the category.</w:t>
+        <w:t>. Description of the resource item.</w:t>
       </w:r>
     </w:p>
     <w:p>
       <w:pPr>
+        <w:numPr>
+          <w:ilvl w:val="0"/>
+          <w:numId w:val="11"/>
+        </w:numPr>
+        <w:spacing w:line="360" w:lineRule="auto"/>
+        <w:ind w:left="425" w:leftChars="0" w:hanging="425" w:firstLineChars="0"/>
+        <w:jc w:val="both"/>
+        <w:rPr>
+          <w:rFonts w:hint="default" w:ascii="Times New Roman" w:hAnsi="Times New Roman" w:cs="Times New Roman"/>
+          <w:sz w:val="24"/>
+          <w:szCs w:val="24"/>
+        </w:rPr>
+      </w:pPr>
+      <w:r>
+        <w:rPr>
+          <w:rFonts w:hint="default" w:ascii="Times New Roman" w:hAnsi="Times New Roman" w:cs="Times New Roman"/>
+          <w:b/>
+          <w:bCs/>
+          <w:sz w:val="24"/>
+          <w:szCs w:val="24"/>
+        </w:rPr>
+        <w:t>Link</w:t>
+      </w:r>
+      <w:r>
+        <w:rPr>
+          <w:rFonts w:hint="default" w:ascii="Times New Roman" w:hAnsi="Times New Roman" w:cs="Times New Roman"/>
+          <w:sz w:val="24"/>
+          <w:szCs w:val="24"/>
+        </w:rPr>
+        <w:t>. External URL for the resource, where applicable.</w:t>
+      </w:r>
+    </w:p>
+    <w:p>
+      <w:pPr>
+        <w:numPr>
+          <w:ilvl w:val="0"/>
+          <w:numId w:val="11"/>
+        </w:numPr>
+        <w:spacing w:line="360" w:lineRule="auto"/>
+        <w:ind w:left="425" w:leftChars="0" w:hanging="425" w:firstLineChars="0"/>
+        <w:jc w:val="both"/>
+        <w:rPr>
+          <w:rFonts w:hint="default" w:ascii="Times New Roman" w:hAnsi="Times New Roman" w:cs="Times New Roman"/>
+          <w:sz w:val="24"/>
+          <w:szCs w:val="24"/>
+        </w:rPr>
+      </w:pPr>
+      <w:r>
+        <w:rPr>
+          <w:rFonts w:hint="default" w:ascii="Times New Roman" w:hAnsi="Times New Roman" w:cs="Times New Roman"/>
+          <w:b/>
+          <w:bCs/>
+          <w:sz w:val="24"/>
+          <w:szCs w:val="24"/>
+        </w:rPr>
+        <w:t>Link Text</w:t>
+      </w:r>
+      <w:r>
+        <w:rPr>
+          <w:rFonts w:hint="default" w:ascii="Times New Roman" w:hAnsi="Times New Roman" w:cs="Times New Roman"/>
+          <w:sz w:val="24"/>
+          <w:szCs w:val="24"/>
+        </w:rPr>
+        <w:t>. User-facing text displayed instead of the raw URL.</w:t>
+      </w:r>
+    </w:p>
+    <w:p>
+      <w:pPr>
+        <w:numPr>
+          <w:ilvl w:val="0"/>
+          <w:numId w:val="11"/>
+        </w:numPr>
+        <w:spacing w:line="360" w:lineRule="auto"/>
+        <w:ind w:left="425" w:leftChars="0" w:hanging="425" w:firstLineChars="0"/>
+        <w:jc w:val="both"/>
+        <w:rPr>
+          <w:rFonts w:hint="default" w:ascii="Times New Roman" w:hAnsi="Times New Roman" w:cs="Times New Roman"/>
+          <w:sz w:val="24"/>
+          <w:szCs w:val="24"/>
+        </w:rPr>
+      </w:pPr>
+      <w:r>
+        <w:rPr>
+          <w:rFonts w:hint="default" w:ascii="Times New Roman" w:hAnsi="Times New Roman" w:cs="Times New Roman"/>
+          <w:b/>
+          <w:bCs/>
+          <w:sz w:val="24"/>
+          <w:szCs w:val="24"/>
+        </w:rPr>
+        <w:t>Link Icon</w:t>
+      </w:r>
+      <w:r>
+        <w:rPr>
+          <w:rFonts w:hint="default" w:ascii="Times New Roman" w:hAnsi="Times New Roman" w:cs="Times New Roman"/>
+          <w:b/>
+          <w:bCs/>
+          <w:sz w:val="24"/>
+          <w:szCs w:val="24"/>
+          <w:lang w:val="en-US"/>
+        </w:rPr>
+        <w:t xml:space="preserve"> (Optional)</w:t>
+      </w:r>
+      <w:r>
+        <w:rPr>
+          <w:rFonts w:hint="default" w:ascii="Times New Roman" w:hAnsi="Times New Roman" w:cs="Times New Roman"/>
+          <w:sz w:val="24"/>
+          <w:szCs w:val="24"/>
+        </w:rPr>
+        <w:t>. The icon associated with the resource link.</w:t>
+      </w:r>
+    </w:p>
+    <w:p>
+      <w:pPr>
+        <w:numPr>
+          <w:ilvl w:val="0"/>
+          <w:numId w:val="11"/>
+        </w:numPr>
+        <w:spacing w:line="360" w:lineRule="auto"/>
+        <w:ind w:left="425" w:leftChars="0" w:hanging="425" w:firstLineChars="0"/>
+        <w:jc w:val="both"/>
+        <w:rPr>
+          <w:rFonts w:hint="default" w:ascii="Times New Roman" w:hAnsi="Times New Roman" w:cs="Times New Roman"/>
+          <w:sz w:val="24"/>
+          <w:szCs w:val="24"/>
+        </w:rPr>
+      </w:pPr>
+      <w:r>
+        <w:rPr>
+          <w:rFonts w:hint="default" w:ascii="Times New Roman" w:hAnsi="Times New Roman" w:cs="Times New Roman"/>
+          <w:b/>
+          <w:bCs/>
+          <w:sz w:val="24"/>
+          <w:szCs w:val="24"/>
+        </w:rPr>
+        <w:t>PDF File</w:t>
+      </w:r>
+      <w:r>
+        <w:rPr>
+          <w:rFonts w:hint="default" w:ascii="Times New Roman" w:hAnsi="Times New Roman" w:cs="Times New Roman"/>
+          <w:b/>
+          <w:bCs/>
+          <w:sz w:val="24"/>
+          <w:szCs w:val="24"/>
+          <w:lang w:val="en-US"/>
+        </w:rPr>
+        <w:t xml:space="preserve"> (Optional)</w:t>
+      </w:r>
+      <w:r>
+        <w:rPr>
+          <w:rFonts w:hint="default" w:ascii="Times New Roman" w:hAnsi="Times New Roman" w:cs="Times New Roman"/>
+          <w:sz w:val="24"/>
+          <w:szCs w:val="24"/>
+        </w:rPr>
+        <w:t>. Source or related PDF file, where applicable.</w:t>
+      </w:r>
+    </w:p>
+    <w:p>
+      <w:pPr>
+        <w:numPr>
+          <w:ilvl w:val="0"/>
+          <w:numId w:val="11"/>
+        </w:numPr>
+        <w:spacing w:line="360" w:lineRule="auto"/>
+        <w:ind w:left="425" w:leftChars="0" w:hanging="425" w:firstLineChars="0"/>
+        <w:jc w:val="both"/>
+        <w:rPr>
+          <w:rFonts w:hint="default" w:ascii="Times New Roman" w:hAnsi="Times New Roman" w:cs="Times New Roman"/>
+          <w:sz w:val="24"/>
+          <w:szCs w:val="24"/>
+        </w:rPr>
+      </w:pPr>
+      <w:r>
+        <w:rPr>
+          <w:rFonts w:hint="default" w:ascii="Times New Roman" w:hAnsi="Times New Roman" w:cs="Times New Roman"/>
+          <w:b/>
+          <w:bCs/>
+          <w:sz w:val="24"/>
+          <w:szCs w:val="24"/>
+        </w:rPr>
+        <w:t>Image (optional)</w:t>
+      </w:r>
+      <w:r>
+        <w:rPr>
+          <w:rFonts w:hint="default" w:ascii="Times New Roman" w:hAnsi="Times New Roman" w:cs="Times New Roman"/>
+          <w:sz w:val="24"/>
+          <w:szCs w:val="24"/>
+        </w:rPr>
+        <w:t>. An image associated with the resource, where applicable.</w:t>
+      </w:r>
+    </w:p>
+    <w:p>
+      <w:pPr>
+        <w:numPr>
+          <w:numId w:val="0"/>
+        </w:numPr>
+        <w:spacing w:line="360" w:lineRule="auto"/>
+        <w:ind w:leftChars="0"/>
+        <w:jc w:val="both"/>
+        <w:rPr>
+          <w:rFonts w:hint="default" w:ascii="Times New Roman" w:hAnsi="Times New Roman" w:cs="Times New Roman"/>
+          <w:sz w:val="24"/>
+          <w:szCs w:val="24"/>
+        </w:rPr>
+      </w:pPr>
+      <w:r>
+        <w:rPr>
+          <w:rFonts w:hint="default" w:ascii="Times New Roman" w:hAnsi="Times New Roman" w:cs="Times New Roman"/>
+          <w:b/>
+          <w:bCs/>
+          <w:sz w:val="24"/>
+          <w:szCs w:val="24"/>
+        </w:rPr>
+        <w:t>Administrative Metadata</w:t>
+      </w:r>
+      <w:r>
+        <w:rPr>
+          <w:rFonts w:hint="default" w:ascii="Times New Roman" w:hAnsi="Times New Roman" w:cs="Times New Roman"/>
+          <w:b/>
+          <w:bCs/>
+          <w:sz w:val="24"/>
+          <w:szCs w:val="24"/>
+          <w:lang w:val="en-US"/>
+        </w:rPr>
+        <w:t xml:space="preserve"> for </w:t>
+      </w:r>
+      <w:r>
+        <w:rPr>
+          <w:rFonts w:hint="default" w:ascii="Times New Roman" w:hAnsi="Times New Roman" w:cs="Times New Roman"/>
+          <w:b/>
+          <w:bCs/>
+          <w:sz w:val="24"/>
+          <w:szCs w:val="24"/>
+        </w:rPr>
+        <w:t>Resource Item</w:t>
+      </w:r>
+    </w:p>
+    <w:p>
+      <w:pPr>
+        <w:numPr>
+          <w:ilvl w:val="0"/>
+          <w:numId w:val="11"/>
+        </w:numPr>
+        <w:spacing w:line="360" w:lineRule="auto"/>
+        <w:ind w:left="425" w:leftChars="0" w:hanging="425" w:firstLineChars="0"/>
+        <w:jc w:val="both"/>
+        <w:rPr>
+          <w:rFonts w:hint="default" w:ascii="Times New Roman" w:hAnsi="Times New Roman" w:cs="Times New Roman"/>
+          <w:sz w:val="24"/>
+          <w:szCs w:val="24"/>
+        </w:rPr>
+      </w:pPr>
+      <w:r>
+        <w:rPr>
+          <w:rFonts w:hint="default" w:ascii="Times New Roman" w:hAnsi="Times New Roman" w:cs="Times New Roman"/>
+          <w:b/>
+          <w:bCs/>
+          <w:sz w:val="24"/>
+          <w:szCs w:val="24"/>
+        </w:rPr>
+        <w:t xml:space="preserve">Approval </w:t>
+      </w:r>
+      <w:r>
+        <w:rPr>
+          <w:rFonts w:hint="default" w:ascii="Times New Roman" w:hAnsi="Times New Roman" w:cs="Times New Roman"/>
+          <w:b/>
+          <w:bCs/>
+          <w:sz w:val="24"/>
+          <w:szCs w:val="24"/>
+          <w:lang w:val="en-US"/>
+        </w:rPr>
+        <w:t>S</w:t>
+      </w:r>
+      <w:r>
+        <w:rPr>
+          <w:rFonts w:hint="default" w:ascii="Times New Roman" w:hAnsi="Times New Roman" w:cs="Times New Roman"/>
+          <w:b/>
+          <w:bCs/>
+          <w:sz w:val="24"/>
+          <w:szCs w:val="24"/>
+        </w:rPr>
+        <w:t>tatus</w:t>
+      </w:r>
+      <w:r>
+        <w:rPr>
+          <w:rFonts w:hint="default" w:ascii="Times New Roman" w:hAnsi="Times New Roman" w:cs="Times New Roman"/>
+          <w:sz w:val="24"/>
+          <w:szCs w:val="24"/>
+          <w:lang w:val="en-US"/>
+        </w:rPr>
+        <w:t xml:space="preserve">. </w:t>
+      </w:r>
+      <w:r>
+        <w:rPr>
+          <w:rFonts w:hint="default" w:ascii="Times New Roman" w:hAnsi="Times New Roman" w:cs="Times New Roman"/>
+          <w:sz w:val="24"/>
+          <w:szCs w:val="24"/>
+        </w:rPr>
+        <w:t>Indicates whether an item is Pending Review, Approved, or Rejected.</w:t>
+      </w:r>
+    </w:p>
+    <w:p>
+      <w:pPr>
+        <w:numPr>
+          <w:ilvl w:val="0"/>
+          <w:numId w:val="11"/>
+        </w:numPr>
+        <w:spacing w:line="360" w:lineRule="auto"/>
+        <w:ind w:left="425" w:leftChars="0" w:hanging="425" w:firstLineChars="0"/>
+        <w:jc w:val="both"/>
+        <w:rPr>
+          <w:rFonts w:hint="default" w:ascii="Times New Roman" w:hAnsi="Times New Roman" w:cs="Times New Roman"/>
+          <w:sz w:val="24"/>
+          <w:szCs w:val="24"/>
+        </w:rPr>
+      </w:pPr>
+      <w:r>
+        <w:rPr>
+          <w:rFonts w:hint="default" w:ascii="Times New Roman" w:hAnsi="Times New Roman" w:cs="Times New Roman"/>
+          <w:b/>
+          <w:bCs/>
+          <w:sz w:val="24"/>
+          <w:szCs w:val="24"/>
+        </w:rPr>
+        <w:t xml:space="preserve">Is </w:t>
+      </w:r>
+      <w:r>
+        <w:rPr>
+          <w:rFonts w:hint="default" w:ascii="Times New Roman" w:hAnsi="Times New Roman" w:cs="Times New Roman"/>
+          <w:b/>
+          <w:bCs/>
+          <w:sz w:val="24"/>
+          <w:szCs w:val="24"/>
+          <w:lang w:val="en-US"/>
+        </w:rPr>
+        <w:t>A</w:t>
+      </w:r>
+      <w:r>
+        <w:rPr>
+          <w:rFonts w:hint="default" w:ascii="Times New Roman" w:hAnsi="Times New Roman" w:cs="Times New Roman"/>
+          <w:b/>
+          <w:bCs/>
+          <w:sz w:val="24"/>
+          <w:szCs w:val="24"/>
+        </w:rPr>
+        <w:t>ctive</w:t>
+      </w:r>
+      <w:r>
+        <w:rPr>
+          <w:rFonts w:hint="default" w:ascii="Times New Roman" w:hAnsi="Times New Roman" w:cs="Times New Roman"/>
+          <w:sz w:val="24"/>
+          <w:szCs w:val="24"/>
+          <w:lang w:val="en-US"/>
+        </w:rPr>
+        <w:t xml:space="preserve">. </w:t>
+      </w:r>
+      <w:r>
+        <w:rPr>
+          <w:rFonts w:hint="default" w:ascii="Times New Roman" w:hAnsi="Times New Roman" w:cs="Times New Roman"/>
+          <w:sz w:val="24"/>
+          <w:szCs w:val="24"/>
+        </w:rPr>
+        <w:t xml:space="preserve"> Controls whether an approved tool/resource is visible to users.</w:t>
+      </w:r>
+    </w:p>
+    <w:p>
+      <w:pPr>
+        <w:numPr>
+          <w:ilvl w:val="0"/>
+          <w:numId w:val="11"/>
+        </w:numPr>
+        <w:spacing w:line="360" w:lineRule="auto"/>
+        <w:ind w:left="425" w:leftChars="0" w:hanging="425" w:firstLineChars="0"/>
+        <w:jc w:val="both"/>
+        <w:rPr>
+          <w:rFonts w:hint="default" w:ascii="Times New Roman" w:hAnsi="Times New Roman" w:cs="Times New Roman"/>
+          <w:sz w:val="24"/>
+          <w:szCs w:val="24"/>
+        </w:rPr>
+      </w:pPr>
+      <w:r>
+        <w:rPr>
+          <w:rFonts w:hint="default" w:ascii="Times New Roman" w:hAnsi="Times New Roman" w:cs="Times New Roman"/>
+          <w:b/>
+          <w:bCs/>
+          <w:sz w:val="24"/>
+          <w:szCs w:val="24"/>
+        </w:rPr>
+        <w:t>Approved by</w:t>
+      </w:r>
+      <w:r>
+        <w:rPr>
+          <w:rFonts w:hint="default" w:ascii="Times New Roman" w:hAnsi="Times New Roman" w:cs="Times New Roman"/>
+          <w:sz w:val="24"/>
+          <w:szCs w:val="24"/>
+          <w:lang w:val="en-US"/>
+        </w:rPr>
+        <w:t>. Records the name of Superuser or Staff/Admin who approved the Resource Item.</w:t>
+      </w:r>
+    </w:p>
+    <w:p>
+      <w:pPr>
+        <w:numPr>
+          <w:ilvl w:val="0"/>
+          <w:numId w:val="11"/>
+        </w:numPr>
+        <w:spacing w:line="360" w:lineRule="auto"/>
+        <w:ind w:left="425" w:leftChars="0" w:hanging="425" w:firstLineChars="0"/>
+        <w:jc w:val="both"/>
+        <w:rPr>
+          <w:rFonts w:hint="default" w:ascii="Times New Roman" w:hAnsi="Times New Roman" w:cs="Times New Roman"/>
+          <w:sz w:val="24"/>
+          <w:szCs w:val="24"/>
+        </w:rPr>
+      </w:pPr>
+      <w:r>
+        <w:rPr>
+          <w:rFonts w:hint="default" w:ascii="Times New Roman" w:hAnsi="Times New Roman" w:cs="Times New Roman"/>
+          <w:b/>
+          <w:bCs/>
+          <w:sz w:val="24"/>
+          <w:szCs w:val="24"/>
+        </w:rPr>
+        <w:t>Approved at</w:t>
+      </w:r>
+      <w:r>
+        <w:rPr>
+          <w:rFonts w:hint="default" w:ascii="Times New Roman" w:hAnsi="Times New Roman" w:cs="Times New Roman"/>
+          <w:sz w:val="24"/>
+          <w:szCs w:val="24"/>
+          <w:lang w:val="en-US"/>
+        </w:rPr>
+        <w:t>. Time and date Superuser or Staff/Admin approved the Resource Item.</w:t>
+      </w:r>
+    </w:p>
+    <w:p>
+      <w:pPr>
+        <w:numPr>
+          <w:ilvl w:val="0"/>
+          <w:numId w:val="11"/>
+        </w:numPr>
+        <w:spacing w:line="360" w:lineRule="auto"/>
+        <w:ind w:left="425" w:leftChars="0" w:hanging="425" w:firstLineChars="0"/>
+        <w:jc w:val="both"/>
+        <w:rPr>
+          <w:rFonts w:hint="default" w:ascii="Times New Roman" w:hAnsi="Times New Roman" w:cs="Times New Roman"/>
+          <w:sz w:val="24"/>
+          <w:szCs w:val="24"/>
+        </w:rPr>
+      </w:pPr>
+      <w:r>
+        <w:rPr>
+          <w:rFonts w:hint="default" w:ascii="Times New Roman" w:hAnsi="Times New Roman" w:cs="Times New Roman"/>
+          <w:b/>
+          <w:bCs/>
+          <w:sz w:val="24"/>
+          <w:szCs w:val="24"/>
+        </w:rPr>
+        <w:t>Preview</w:t>
+      </w:r>
+      <w:r>
+        <w:rPr>
+          <w:rFonts w:hint="default" w:ascii="Times New Roman" w:hAnsi="Times New Roman" w:cs="Times New Roman"/>
+          <w:sz w:val="24"/>
+          <w:szCs w:val="24"/>
+          <w:lang w:val="en-US"/>
+        </w:rPr>
+        <w:t>. Shows the preview of the Image.</w:t>
+      </w:r>
+    </w:p>
+    <w:p>
+      <w:pPr>
+        <w:numPr>
+          <w:ilvl w:val="0"/>
+          <w:numId w:val="11"/>
+        </w:numPr>
+        <w:spacing w:line="360" w:lineRule="auto"/>
+        <w:ind w:left="425" w:leftChars="0" w:hanging="425" w:firstLineChars="0"/>
+        <w:jc w:val="both"/>
+        <w:rPr>
+          <w:rFonts w:hint="default" w:ascii="Times New Roman" w:hAnsi="Times New Roman" w:cs="Times New Roman"/>
+          <w:sz w:val="24"/>
+          <w:szCs w:val="24"/>
+        </w:rPr>
+      </w:pPr>
+      <w:r>
+        <w:rPr>
+          <w:rFonts w:hint="default" w:ascii="Times New Roman" w:hAnsi="Times New Roman" w:cs="Times New Roman"/>
+          <w:b/>
+          <w:bCs/>
+          <w:sz w:val="24"/>
+          <w:szCs w:val="24"/>
+        </w:rPr>
+        <w:t>Delete?</w:t>
+      </w:r>
+      <w:r>
+        <w:rPr>
+          <w:rFonts w:hint="default" w:ascii="Times New Roman" w:hAnsi="Times New Roman" w:cs="Times New Roman"/>
+          <w:sz w:val="24"/>
+          <w:szCs w:val="24"/>
+          <w:lang w:val="en-US"/>
+        </w:rPr>
+        <w:t>. Selected when two or more Resource Item are to be deleted from a single Resource Category.</w:t>
+      </w:r>
+    </w:p>
+    <w:p>
+      <w:pPr>
         <w:spacing w:line="360" w:lineRule="auto"/>
         <w:jc w:val="both"/>
         <w:rPr>
@@ -2071,7 +2931,65 @@
           <w:sz w:val="24"/>
           <w:szCs w:val="24"/>
         </w:rPr>
-        <w:t>4.6 Resource Item Metadata</w:t>
+        <w:t>5. Metadata That Could Be Added</w:t>
+      </w:r>
+    </w:p>
+    <w:p>
+      <w:pPr>
+        <w:spacing w:line="360" w:lineRule="auto"/>
+        <w:jc w:val="both"/>
+        <w:rPr>
+          <w:rFonts w:hint="default" w:ascii="Times New Roman" w:hAnsi="Times New Roman" w:cs="Times New Roman"/>
+          <w:sz w:val="24"/>
+          <w:szCs w:val="24"/>
+        </w:rPr>
+      </w:pPr>
+      <w:r>
+        <w:rPr>
+          <w:rFonts w:hint="default" w:ascii="Times New Roman" w:hAnsi="Times New Roman" w:cs="Times New Roman"/>
+          <w:sz w:val="24"/>
+          <w:szCs w:val="24"/>
+        </w:rPr>
+        <w:t xml:space="preserve">The following are proposed additions identified from the current structure. They are not part of Taxonomy System </w:t>
+      </w:r>
+      <w:r>
+        <w:rPr>
+          <w:rFonts w:hint="default" w:ascii="Times New Roman" w:hAnsi="Times New Roman" w:cs="Times New Roman"/>
+          <w:b/>
+          <w:bCs/>
+          <w:sz w:val="24"/>
+          <w:szCs w:val="24"/>
+        </w:rPr>
+        <w:t>v</w:t>
+      </w:r>
+      <w:r>
+        <w:rPr>
+          <w:rFonts w:hint="default" w:ascii="Times New Roman" w:hAnsi="Times New Roman" w:cs="Times New Roman"/>
+          <w:b/>
+          <w:bCs/>
+          <w:sz w:val="24"/>
+          <w:szCs w:val="24"/>
+          <w:lang w:val="en-US"/>
+        </w:rPr>
+        <w:t>0.5</w:t>
+      </w:r>
+      <w:r>
+        <w:rPr>
+          <w:rFonts w:hint="default" w:ascii="Times New Roman" w:hAnsi="Times New Roman" w:cs="Times New Roman"/>
+          <w:b/>
+          <w:bCs/>
+          <w:sz w:val="24"/>
+          <w:szCs w:val="24"/>
+        </w:rPr>
+        <w:t>.0</w:t>
+      </w:r>
+      <w:r>
+        <w:rPr>
+          <w:rFonts w:hint="default" w:ascii="Times New Roman" w:hAnsi="Times New Roman" w:cs="Times New Roman"/>
+          <w:sz w:val="24"/>
+          <w:szCs w:val="24"/>
+        </w:rPr>
+        <w:t xml:space="preserve"> unless formally adopted. They are intended to improve discoverability, verification, and consistent curation without changing the established hierarchy.</w:t>
       </w:r>
     </w:p>
     <w:p>
@@ -2097,15 +3015,15 @@
           <w:sz w:val="24"/>
           <w:szCs w:val="24"/>
         </w:rPr>
-        <w:t>Category</w:t>
-      </w:r>
-      <w:r>
-        <w:rPr>
-          <w:rFonts w:hint="default" w:ascii="Times New Roman" w:hAnsi="Times New Roman" w:cs="Times New Roman"/>
-          <w:sz w:val="24"/>
-          <w:szCs w:val="24"/>
-        </w:rPr>
-        <w:t>. The resource category in which the item is placed.</w:t>
+        <w:t>Last Verified</w:t>
+      </w:r>
+      <w:r>
+        <w:rPr>
+          <w:rFonts w:hint="default" w:ascii="Times New Roman" w:hAnsi="Times New Roman" w:cs="Times New Roman"/>
+          <w:sz w:val="24"/>
+          <w:szCs w:val="24"/>
+        </w:rPr>
+        <w:t>. Date on which the external URL and basic resource information were last checked. This supports ongoing curation of external links.</w:t>
       </w:r>
     </w:p>
     <w:p>
@@ -2131,15 +3049,15 @@
           <w:sz w:val="24"/>
           <w:szCs w:val="24"/>
         </w:rPr>
-        <w:t>Title</w:t>
-      </w:r>
-      <w:r>
-        <w:rPr>
-          <w:rFonts w:hint="default" w:ascii="Times New Roman" w:hAnsi="Times New Roman" w:cs="Times New Roman"/>
-          <w:sz w:val="24"/>
-          <w:szCs w:val="24"/>
-        </w:rPr>
-        <w:t>. The name/title of the resource.</w:t>
+        <w:t>Documentation URL</w:t>
+      </w:r>
+      <w:r>
+        <w:rPr>
+          <w:rFonts w:hint="default" w:ascii="Times New Roman" w:hAnsi="Times New Roman" w:cs="Times New Roman"/>
+          <w:sz w:val="24"/>
+          <w:szCs w:val="24"/>
+        </w:rPr>
+        <w:t>. A direct link to official documentation when it differs from the main tool URL.</w:t>
       </w:r>
     </w:p>
     <w:p>
@@ -2165,15 +3083,15 @@
           <w:sz w:val="24"/>
           <w:szCs w:val="24"/>
         </w:rPr>
-        <w:t>Description</w:t>
-      </w:r>
-      <w:r>
-        <w:rPr>
-          <w:rFonts w:hint="default" w:ascii="Times New Roman" w:hAnsi="Times New Roman" w:cs="Times New Roman"/>
-          <w:sz w:val="24"/>
-          <w:szCs w:val="24"/>
-        </w:rPr>
-        <w:t>. Description of the resource item.</w:t>
+        <w:t>Repository URL</w:t>
+      </w:r>
+      <w:r>
+        <w:rPr>
+          <w:rFonts w:hint="default" w:ascii="Times New Roman" w:hAnsi="Times New Roman" w:cs="Times New Roman"/>
+          <w:sz w:val="24"/>
+          <w:szCs w:val="24"/>
+        </w:rPr>
+        <w:t>. A source-code repository link when publicly available.</w:t>
       </w:r>
     </w:p>
     <w:p>
@@ -2199,15 +3117,15 @@
           <w:sz w:val="24"/>
           <w:szCs w:val="24"/>
         </w:rPr>
-        <w:t>Link</w:t>
-      </w:r>
-      <w:r>
-        <w:rPr>
-          <w:rFonts w:hint="default" w:ascii="Times New Roman" w:hAnsi="Times New Roman" w:cs="Times New Roman"/>
-          <w:sz w:val="24"/>
-          <w:szCs w:val="24"/>
-        </w:rPr>
-        <w:t>. External URL for the resource, where applicable.</w:t>
+        <w:t>Input</w:t>
+      </w:r>
+      <w:r>
+        <w:rPr>
+          <w:rFonts w:hint="default" w:ascii="Times New Roman" w:hAnsi="Times New Roman" w:cs="Times New Roman"/>
+          <w:sz w:val="24"/>
+          <w:szCs w:val="24"/>
+        </w:rPr>
+        <w:t>. A concise description of the main data/input accepted by an interactive tool. This is useful for distinguishing tools with similar functions.</w:t>
       </w:r>
     </w:p>
     <w:p>
@@ -2233,15 +3151,15 @@
           <w:sz w:val="24"/>
           <w:szCs w:val="24"/>
         </w:rPr>
-        <w:t>Link Text</w:t>
-      </w:r>
-      <w:r>
-        <w:rPr>
-          <w:rFonts w:hint="default" w:ascii="Times New Roman" w:hAnsi="Times New Roman" w:cs="Times New Roman"/>
-          <w:sz w:val="24"/>
-          <w:szCs w:val="24"/>
-        </w:rPr>
-        <w:t>. User-facing text displayed instead of the raw URL.</w:t>
+        <w:t>Output</w:t>
+      </w:r>
+      <w:r>
+        <w:rPr>
+          <w:rFonts w:hint="default" w:ascii="Times New Roman" w:hAnsi="Times New Roman" w:cs="Times New Roman"/>
+          <w:sz w:val="24"/>
+          <w:szCs w:val="24"/>
+        </w:rPr>
+        <w:t>. A concise description of the principal result/output produced by a tool.</w:t>
       </w:r>
     </w:p>
     <w:p>
@@ -2267,15 +3185,15 @@
           <w:sz w:val="24"/>
           <w:szCs w:val="24"/>
         </w:rPr>
-        <w:t>Link Icon</w:t>
-      </w:r>
-      <w:r>
-        <w:rPr>
-          <w:rFonts w:hint="default" w:ascii="Times New Roman" w:hAnsi="Times New Roman" w:cs="Times New Roman"/>
-          <w:sz w:val="24"/>
-          <w:szCs w:val="24"/>
-        </w:rPr>
-        <w:t>. The icon associated with the resource link.</w:t>
+        <w:t>Organism Scope</w:t>
+      </w:r>
+      <w:r>
+        <w:rPr>
+          <w:rFonts w:hint="default" w:ascii="Times New Roman" w:hAnsi="Times New Roman" w:cs="Times New Roman"/>
+          <w:sz w:val="24"/>
+          <w:szCs w:val="24"/>
+        </w:rPr>
+        <w:t>. The organism(s) to which a tool applies. This would support filtering across the taxonomy without changing the Organism-Specific hierarchy.</w:t>
       </w:r>
     </w:p>
     <w:p>
@@ -2301,33 +3219,21 @@
           <w:sz w:val="24"/>
           <w:szCs w:val="24"/>
         </w:rPr>
-        <w:t>PDF File</w:t>
-      </w:r>
-      <w:r>
-        <w:rPr>
-          <w:rFonts w:hint="default" w:ascii="Times New Roman" w:hAnsi="Times New Roman" w:cs="Times New Roman"/>
-          <w:sz w:val="24"/>
-          <w:szCs w:val="24"/>
-        </w:rPr>
-        <w:t>. Source or related PDF file, where applicable.</w:t>
+        <w:t>One Health Sector</w:t>
+      </w:r>
+      <w:r>
+        <w:rPr>
+          <w:rFonts w:hint="default" w:ascii="Times New Roman" w:hAnsi="Times New Roman" w:cs="Times New Roman"/>
+          <w:sz w:val="24"/>
+          <w:szCs w:val="24"/>
+        </w:rPr>
+        <w:t>. Where relevant, identifies the sector(s) addressed by a resource, such as human, animal, food, plant, wildlife, or environmental health.</w:t>
       </w:r>
     </w:p>
     <w:p>
       <w:pPr>
-        <w:numPr>
-          <w:ilvl w:val="0"/>
-          <w:numId w:val="12"/>
-        </w:numPr>
         <w:spacing w:line="360" w:lineRule="auto"/>
-        <w:ind w:left="425" w:leftChars="0" w:hanging="425" w:firstLineChars="0"/>
         <w:jc w:val="both"/>
-        <w:rPr>
-          <w:rFonts w:hint="default" w:ascii="Times New Roman" w:hAnsi="Times New Roman" w:cs="Times New Roman"/>
-          <w:sz w:val="24"/>
-          <w:szCs w:val="24"/>
-        </w:rPr>
-      </w:pPr>
-      <w:r>
         <w:rPr>
           <w:rFonts w:hint="default" w:ascii="Times New Roman" w:hAnsi="Times New Roman" w:cs="Times New Roman"/>
           <w:b/>
@@ -2335,21 +3241,8 @@
           <w:sz w:val="24"/>
           <w:szCs w:val="24"/>
         </w:rPr>
-        <w:t>Image (optional)</w:t>
-      </w:r>
-      <w:r>
-        <w:rPr>
-          <w:rFonts w:hint="default" w:ascii="Times New Roman" w:hAnsi="Times New Roman" w:cs="Times New Roman"/>
-          <w:sz w:val="24"/>
-          <w:szCs w:val="24"/>
-        </w:rPr>
-        <w:t>. An image associated with the resource, where applicable.</w:t>
-      </w:r>
-    </w:p>
-    <w:p>
-      <w:pPr>
-        <w:spacing w:line="360" w:lineRule="auto"/>
-        <w:jc w:val="both"/>
+      </w:pPr>
+      <w:r>
         <w:rPr>
           <w:rFonts w:hint="default" w:ascii="Times New Roman" w:hAnsi="Times New Roman" w:cs="Times New Roman"/>
           <w:b/>
@@ -2357,74 +3250,7 @@
           <w:sz w:val="24"/>
           <w:szCs w:val="24"/>
         </w:rPr>
-      </w:pPr>
-      <w:r>
-        <w:rPr>
-          <w:rFonts w:hint="default" w:ascii="Times New Roman" w:hAnsi="Times New Roman" w:cs="Times New Roman"/>
-          <w:b/>
-          <w:bCs/>
-          <w:sz w:val="24"/>
-          <w:szCs w:val="24"/>
-        </w:rPr>
-        <w:t>5. Metadata That Could Be Added</w:t>
-      </w:r>
-    </w:p>
-    <w:p>
-      <w:pPr>
-        <w:spacing w:line="360" w:lineRule="auto"/>
-        <w:jc w:val="both"/>
-        <w:rPr>
-          <w:rFonts w:hint="default" w:ascii="Times New Roman" w:hAnsi="Times New Roman" w:cs="Times New Roman"/>
-          <w:sz w:val="24"/>
-          <w:szCs w:val="24"/>
-        </w:rPr>
-      </w:pPr>
-      <w:r>
-        <w:rPr>
-          <w:rFonts w:hint="default" w:ascii="Times New Roman" w:hAnsi="Times New Roman" w:cs="Times New Roman"/>
-          <w:sz w:val="24"/>
-          <w:szCs w:val="24"/>
-        </w:rPr>
-        <w:t xml:space="preserve">The following are proposed additions identified from the current structure. They are not part of Taxonomy System </w:t>
-      </w:r>
-      <w:r>
-        <w:rPr>
-          <w:rFonts w:hint="default" w:ascii="Times New Roman" w:hAnsi="Times New Roman" w:cs="Times New Roman"/>
-          <w:b/>
-          <w:bCs/>
-          <w:sz w:val="24"/>
-          <w:szCs w:val="24"/>
-        </w:rPr>
-        <w:t>v</w:t>
-      </w:r>
-      <w:r>
-        <w:rPr>
-          <w:rFonts w:hint="default" w:ascii="Times New Roman" w:hAnsi="Times New Roman" w:cs="Times New Roman"/>
-          <w:b/>
-          <w:bCs/>
-          <w:sz w:val="24"/>
-          <w:szCs w:val="24"/>
-          <w:lang w:val="en-US"/>
-        </w:rPr>
-        <w:t>0.5</w:t>
-      </w:r>
-      <w:r>
-        <w:rPr>
-          <w:rFonts w:hint="default" w:ascii="Times New Roman" w:hAnsi="Times New Roman" w:cs="Times New Roman"/>
-          <w:b/>
-          <w:bCs/>
-          <w:sz w:val="24"/>
-          <w:szCs w:val="24"/>
-        </w:rPr>
-        <w:t>.0</w:t>
-      </w:r>
-      <w:r>
-        <w:rPr>
-          <w:rFonts w:hint="default" w:ascii="Times New Roman" w:hAnsi="Times New Roman" w:cs="Times New Roman"/>
-          <w:sz w:val="24"/>
-          <w:szCs w:val="24"/>
-        </w:rPr>
-        <w:t xml:space="preserve"> unless formally adopted. They are intended to improve discoverability, verification, and consistent curation without changing the established hierarchy.</w:t>
+        <w:t>6. Classification Logic</w:t>
       </w:r>
     </w:p>
     <w:p>
@@ -2450,15 +3276,15 @@
           <w:sz w:val="24"/>
           <w:szCs w:val="24"/>
         </w:rPr>
-        <w:t>Last Verified</w:t>
-      </w:r>
-      <w:r>
-        <w:rPr>
-          <w:rFonts w:hint="default" w:ascii="Times New Roman" w:hAnsi="Times New Roman" w:cs="Times New Roman"/>
-          <w:sz w:val="24"/>
-          <w:szCs w:val="24"/>
-        </w:rPr>
-        <w:t>. Date on which the external URL and basic resource information were last checked. This supports ongoing curation of external links.</w:t>
+        <w:t>First-level distinction</w:t>
+      </w:r>
+      <w:r>
+        <w:rPr>
+          <w:rFonts w:hint="default" w:ascii="Times New Roman" w:hAnsi="Times New Roman" w:cs="Times New Roman"/>
+          <w:sz w:val="24"/>
+          <w:szCs w:val="24"/>
+        </w:rPr>
+        <w:t>. Items are separated into Tools and Resources according to their primary role and user interaction.</w:t>
       </w:r>
     </w:p>
     <w:p>
@@ -2484,15 +3310,15 @@
           <w:sz w:val="24"/>
           <w:szCs w:val="24"/>
         </w:rPr>
-        <w:t>Documentation URL</w:t>
-      </w:r>
-      <w:r>
-        <w:rPr>
-          <w:rFonts w:hint="default" w:ascii="Times New Roman" w:hAnsi="Times New Roman" w:cs="Times New Roman"/>
-          <w:sz w:val="24"/>
-          <w:szCs w:val="24"/>
-        </w:rPr>
-        <w:t>. A direct link to official documentation when it differs from the main tool URL.</w:t>
+        <w:t>Organism-specific classification</w:t>
+      </w:r>
+      <w:r>
+        <w:rPr>
+          <w:rFonts w:hint="default" w:ascii="Times New Roman" w:hAnsi="Times New Roman" w:cs="Times New Roman"/>
+          <w:sz w:val="24"/>
+          <w:szCs w:val="24"/>
+        </w:rPr>
+        <w:t>. Tools primarily associated with one priority organism are placed under that organism. Individual tools sit directly within the organism category.</w:t>
       </w:r>
     </w:p>
     <w:p>
@@ -2518,15 +3344,15 @@
           <w:sz w:val="24"/>
           <w:szCs w:val="24"/>
         </w:rPr>
-        <w:t>Repository URL</w:t>
-      </w:r>
-      <w:r>
-        <w:rPr>
-          <w:rFonts w:hint="default" w:ascii="Times New Roman" w:hAnsi="Times New Roman" w:cs="Times New Roman"/>
-          <w:sz w:val="24"/>
-          <w:szCs w:val="24"/>
-        </w:rPr>
-        <w:t>. A source-code repository link when publicly available.</w:t>
+        <w:t>General-use classification</w:t>
+      </w:r>
+      <w:r>
+        <w:rPr>
+          <w:rFonts w:hint="default" w:ascii="Times New Roman" w:hAnsi="Times New Roman" w:cs="Times New Roman"/>
+          <w:sz w:val="24"/>
+          <w:szCs w:val="24"/>
+        </w:rPr>
+        <w:t>. Tools applicable across multiple organisms are grouped according to their principal analytical function.</w:t>
       </w:r>
     </w:p>
     <w:p>
@@ -2552,15 +3378,15 @@
           <w:sz w:val="24"/>
           <w:szCs w:val="24"/>
         </w:rPr>
-        <w:t>Input</w:t>
-      </w:r>
-      <w:r>
-        <w:rPr>
-          <w:rFonts w:hint="default" w:ascii="Times New Roman" w:hAnsi="Times New Roman" w:cs="Times New Roman"/>
-          <w:sz w:val="24"/>
-          <w:szCs w:val="24"/>
-        </w:rPr>
-        <w:t>. A concise description of the main data/input accepted by an interactive tool. This is useful for distinguishing tools with similar functions.</w:t>
+        <w:t>Resource classification</w:t>
+      </w:r>
+      <w:r>
+        <w:rPr>
+          <w:rFonts w:hint="default" w:ascii="Times New Roman" w:hAnsi="Times New Roman" w:cs="Times New Roman"/>
+          <w:sz w:val="24"/>
+          <w:szCs w:val="24"/>
+        </w:rPr>
+        <w:t>. Resources are grouped according to their principal knowledge, surveillance, sector, policy, laboratory/training, or environmental purpose.</w:t>
       </w:r>
     </w:p>
     <w:p>
@@ -2586,15 +3412,15 @@
           <w:sz w:val="24"/>
           <w:szCs w:val="24"/>
         </w:rPr>
-        <w:t>Output</w:t>
-      </w:r>
-      <w:r>
-        <w:rPr>
-          <w:rFonts w:hint="default" w:ascii="Times New Roman" w:hAnsi="Times New Roman" w:cs="Times New Roman"/>
-          <w:sz w:val="24"/>
-          <w:szCs w:val="24"/>
-        </w:rPr>
-        <w:t>. A concise description of the principal result/output produced by a tool.</w:t>
+        <w:t>Controlled classification</w:t>
+      </w:r>
+      <w:r>
+        <w:rPr>
+          <w:rFonts w:hint="default" w:ascii="Times New Roman" w:hAnsi="Times New Roman" w:cs="Times New Roman"/>
+          <w:sz w:val="24"/>
+          <w:szCs w:val="24"/>
+        </w:rPr>
+        <w:t>. Category and Tool Type provide controlled tags that help staff consistently classify and differentiate entries.</w:t>
       </w:r>
     </w:p>
     <w:p>
@@ -2620,33 +3446,21 @@
           <w:sz w:val="24"/>
           <w:szCs w:val="24"/>
         </w:rPr>
-        <w:t>Organism Scope</w:t>
-      </w:r>
-      <w:r>
-        <w:rPr>
-          <w:rFonts w:hint="default" w:ascii="Times New Roman" w:hAnsi="Times New Roman" w:cs="Times New Roman"/>
-          <w:sz w:val="24"/>
-          <w:szCs w:val="24"/>
-        </w:rPr>
-        <w:t>. The organism(s) to which a tool applies. This would support filtering across the taxonomy without changing the Organism-Specific hierarchy.</w:t>
+        <w:t>Extensibility</w:t>
+      </w:r>
+      <w:r>
+        <w:rPr>
+          <w:rFonts w:hint="default" w:ascii="Times New Roman" w:hAnsi="Times New Roman" w:cs="Times New Roman"/>
+          <w:sz w:val="24"/>
+          <w:szCs w:val="24"/>
+        </w:rPr>
+        <w:t>. The taxonomy is designed to evolve. Additional priority organisms and improved resource categories can be incorporated through controlled updates and versioning.</w:t>
       </w:r>
     </w:p>
     <w:p>
       <w:pPr>
-        <w:numPr>
-          <w:ilvl w:val="0"/>
-          <w:numId w:val="13"/>
-        </w:numPr>
         <w:spacing w:line="360" w:lineRule="auto"/>
-        <w:ind w:left="425" w:leftChars="0" w:hanging="425" w:firstLineChars="0"/>
         <w:jc w:val="both"/>
-        <w:rPr>
-          <w:rFonts w:hint="default" w:ascii="Times New Roman" w:hAnsi="Times New Roman" w:cs="Times New Roman"/>
-          <w:sz w:val="24"/>
-          <w:szCs w:val="24"/>
-        </w:rPr>
-      </w:pPr>
-      <w:r>
         <w:rPr>
           <w:rFonts w:hint="default" w:ascii="Times New Roman" w:hAnsi="Times New Roman" w:cs="Times New Roman"/>
           <w:b/>
@@ -2654,15 +3468,16 @@
           <w:sz w:val="24"/>
           <w:szCs w:val="24"/>
         </w:rPr>
-        <w:t>One Health Sector</w:t>
-      </w:r>
-      <w:r>
-        <w:rPr>
-          <w:rFonts w:hint="default" w:ascii="Times New Roman" w:hAnsi="Times New Roman" w:cs="Times New Roman"/>
-          <w:sz w:val="24"/>
-          <w:szCs w:val="24"/>
-        </w:rPr>
-        <w:t>. Where relevant, identifies the sector(s) addressed by a resource, such as human, animal, food, plant, wildlife, or environmental health.</w:t>
+      </w:pPr>
+      <w:r>
+        <w:rPr>
+          <w:rFonts w:hint="default" w:ascii="Times New Roman" w:hAnsi="Times New Roman" w:cs="Times New Roman"/>
+          <w:b/>
+          <w:bCs/>
+          <w:sz w:val="24"/>
+          <w:szCs w:val="24"/>
+        </w:rPr>
+        <w:t>7. Taxonomy Maintenance and Versioning</w:t>
       </w:r>
     </w:p>
     <w:p>
@@ -2671,267 +3486,17 @@
         <w:jc w:val="both"/>
         <w:rPr>
           <w:rFonts w:hint="default" w:ascii="Times New Roman" w:hAnsi="Times New Roman" w:cs="Times New Roman"/>
-          <w:b/>
-          <w:bCs/>
-          <w:sz w:val="24"/>
-          <w:szCs w:val="24"/>
-        </w:rPr>
-      </w:pPr>
-      <w:r>
-        <w:rPr>
-          <w:rFonts w:hint="default" w:ascii="Times New Roman" w:hAnsi="Times New Roman" w:cs="Times New Roman"/>
-          <w:b/>
-          <w:bCs/>
-          <w:sz w:val="24"/>
-          <w:szCs w:val="24"/>
-        </w:rPr>
-        <w:t>6. Classification Logic</w:t>
-      </w:r>
-    </w:p>
-    <w:p>
-      <w:pPr>
-        <w:numPr>
-          <w:ilvl w:val="0"/>
-          <w:numId w:val="14"/>
-        </w:numPr>
-        <w:spacing w:line="360" w:lineRule="auto"/>
-        <w:ind w:left="425" w:leftChars="0" w:hanging="425" w:firstLineChars="0"/>
-        <w:jc w:val="both"/>
-        <w:rPr>
-          <w:rFonts w:hint="default" w:ascii="Times New Roman" w:hAnsi="Times New Roman" w:cs="Times New Roman"/>
-          <w:sz w:val="24"/>
-          <w:szCs w:val="24"/>
-        </w:rPr>
-      </w:pPr>
-      <w:r>
-        <w:rPr>
-          <w:rFonts w:hint="default" w:ascii="Times New Roman" w:hAnsi="Times New Roman" w:cs="Times New Roman"/>
-          <w:b/>
-          <w:bCs/>
-          <w:sz w:val="24"/>
-          <w:szCs w:val="24"/>
-        </w:rPr>
-        <w:t>First-level distinction</w:t>
-      </w:r>
-      <w:r>
-        <w:rPr>
-          <w:rFonts w:hint="default" w:ascii="Times New Roman" w:hAnsi="Times New Roman" w:cs="Times New Roman"/>
-          <w:sz w:val="24"/>
-          <w:szCs w:val="24"/>
-        </w:rPr>
-        <w:t>. Items are separated into Tools and Resources according to their primary role and user interaction.</w:t>
-      </w:r>
-    </w:p>
-    <w:p>
-      <w:pPr>
-        <w:numPr>
-          <w:ilvl w:val="0"/>
-          <w:numId w:val="14"/>
-        </w:numPr>
-        <w:spacing w:line="360" w:lineRule="auto"/>
-        <w:ind w:left="425" w:leftChars="0" w:hanging="425" w:firstLineChars="0"/>
-        <w:jc w:val="both"/>
-        <w:rPr>
-          <w:rFonts w:hint="default" w:ascii="Times New Roman" w:hAnsi="Times New Roman" w:cs="Times New Roman"/>
-          <w:sz w:val="24"/>
-          <w:szCs w:val="24"/>
-        </w:rPr>
-      </w:pPr>
-      <w:r>
-        <w:rPr>
-          <w:rFonts w:hint="default" w:ascii="Times New Roman" w:hAnsi="Times New Roman" w:cs="Times New Roman"/>
-          <w:b/>
-          <w:bCs/>
-          <w:sz w:val="24"/>
-          <w:szCs w:val="24"/>
-        </w:rPr>
-        <w:t>Organism-specific classification</w:t>
-      </w:r>
-      <w:r>
-        <w:rPr>
-          <w:rFonts w:hint="default" w:ascii="Times New Roman" w:hAnsi="Times New Roman" w:cs="Times New Roman"/>
-          <w:sz w:val="24"/>
-          <w:szCs w:val="24"/>
-        </w:rPr>
-        <w:t>. Tools primarily associated with one priority organism are placed under that organism. Individual tools sit directly within the organism category.</w:t>
-      </w:r>
-    </w:p>
-    <w:p>
-      <w:pPr>
-        <w:numPr>
-          <w:ilvl w:val="0"/>
-          <w:numId w:val="14"/>
-        </w:numPr>
-        <w:spacing w:line="360" w:lineRule="auto"/>
-        <w:ind w:left="425" w:leftChars="0" w:hanging="425" w:firstLineChars="0"/>
-        <w:jc w:val="both"/>
-        <w:rPr>
-          <w:rFonts w:hint="default" w:ascii="Times New Roman" w:hAnsi="Times New Roman" w:cs="Times New Roman"/>
-          <w:sz w:val="24"/>
-          <w:szCs w:val="24"/>
-        </w:rPr>
-      </w:pPr>
-      <w:r>
-        <w:rPr>
-          <w:rFonts w:hint="default" w:ascii="Times New Roman" w:hAnsi="Times New Roman" w:cs="Times New Roman"/>
-          <w:b/>
-          <w:bCs/>
-          <w:sz w:val="24"/>
-          <w:szCs w:val="24"/>
-        </w:rPr>
-        <w:t>General-use classification</w:t>
-      </w:r>
-      <w:r>
-        <w:rPr>
-          <w:rFonts w:hint="default" w:ascii="Times New Roman" w:hAnsi="Times New Roman" w:cs="Times New Roman"/>
-          <w:sz w:val="24"/>
-          <w:szCs w:val="24"/>
-        </w:rPr>
-        <w:t>. Tools applicable across multiple organisms are grouped according to their principal analytical function.</w:t>
-      </w:r>
-    </w:p>
-    <w:p>
-      <w:pPr>
-        <w:numPr>
-          <w:ilvl w:val="0"/>
-          <w:numId w:val="14"/>
-        </w:numPr>
-        <w:spacing w:line="360" w:lineRule="auto"/>
-        <w:ind w:left="425" w:leftChars="0" w:hanging="425" w:firstLineChars="0"/>
-        <w:jc w:val="both"/>
-        <w:rPr>
-          <w:rFonts w:hint="default" w:ascii="Times New Roman" w:hAnsi="Times New Roman" w:cs="Times New Roman"/>
-          <w:sz w:val="24"/>
-          <w:szCs w:val="24"/>
-        </w:rPr>
-      </w:pPr>
-      <w:r>
-        <w:rPr>
-          <w:rFonts w:hint="default" w:ascii="Times New Roman" w:hAnsi="Times New Roman" w:cs="Times New Roman"/>
-          <w:b/>
-          <w:bCs/>
-          <w:sz w:val="24"/>
-          <w:szCs w:val="24"/>
-        </w:rPr>
-        <w:t>Resource classification</w:t>
-      </w:r>
-      <w:r>
-        <w:rPr>
-          <w:rFonts w:hint="default" w:ascii="Times New Roman" w:hAnsi="Times New Roman" w:cs="Times New Roman"/>
-          <w:sz w:val="24"/>
-          <w:szCs w:val="24"/>
-        </w:rPr>
-        <w:t>. Resources are grouped according to their principal knowledge, surveillance, sector, policy, laboratory/training, or environmental purpose.</w:t>
-      </w:r>
-    </w:p>
-    <w:p>
-      <w:pPr>
-        <w:numPr>
-          <w:ilvl w:val="0"/>
-          <w:numId w:val="14"/>
-        </w:numPr>
-        <w:spacing w:line="360" w:lineRule="auto"/>
-        <w:ind w:left="425" w:leftChars="0" w:hanging="425" w:firstLineChars="0"/>
-        <w:jc w:val="both"/>
-        <w:rPr>
-          <w:rFonts w:hint="default" w:ascii="Times New Roman" w:hAnsi="Times New Roman" w:cs="Times New Roman"/>
-          <w:sz w:val="24"/>
-          <w:szCs w:val="24"/>
-        </w:rPr>
-      </w:pPr>
-      <w:r>
-        <w:rPr>
-          <w:rFonts w:hint="default" w:ascii="Times New Roman" w:hAnsi="Times New Roman" w:cs="Times New Roman"/>
-          <w:b/>
-          <w:bCs/>
-          <w:sz w:val="24"/>
-          <w:szCs w:val="24"/>
-        </w:rPr>
-        <w:t>Controlled classification</w:t>
-      </w:r>
-      <w:r>
-        <w:rPr>
-          <w:rFonts w:hint="default" w:ascii="Times New Roman" w:hAnsi="Times New Roman" w:cs="Times New Roman"/>
-          <w:sz w:val="24"/>
-          <w:szCs w:val="24"/>
-        </w:rPr>
-        <w:t>. Category and Tool Type provide controlled tags that help staff consistently classify and differentiate entries.</w:t>
-      </w:r>
-    </w:p>
-    <w:p>
-      <w:pPr>
-        <w:numPr>
-          <w:ilvl w:val="0"/>
-          <w:numId w:val="14"/>
-        </w:numPr>
-        <w:spacing w:line="360" w:lineRule="auto"/>
-        <w:ind w:left="425" w:leftChars="0" w:hanging="425" w:firstLineChars="0"/>
-        <w:jc w:val="both"/>
-        <w:rPr>
-          <w:rFonts w:hint="default" w:ascii="Times New Roman" w:hAnsi="Times New Roman" w:cs="Times New Roman"/>
-          <w:sz w:val="24"/>
-          <w:szCs w:val="24"/>
-        </w:rPr>
-      </w:pPr>
-      <w:r>
-        <w:rPr>
-          <w:rFonts w:hint="default" w:ascii="Times New Roman" w:hAnsi="Times New Roman" w:cs="Times New Roman"/>
-          <w:b/>
-          <w:bCs/>
-          <w:sz w:val="24"/>
-          <w:szCs w:val="24"/>
-        </w:rPr>
-        <w:t>Extensibility</w:t>
-      </w:r>
-      <w:r>
-        <w:rPr>
-          <w:rFonts w:hint="default" w:ascii="Times New Roman" w:hAnsi="Times New Roman" w:cs="Times New Roman"/>
-          <w:sz w:val="24"/>
-          <w:szCs w:val="24"/>
-        </w:rPr>
-        <w:t>. The taxonomy is designed to evolve. Additional priority organisms and improved resource categories can be incorporated through controlled updates and versioning.</w:t>
-      </w:r>
-    </w:p>
-    <w:p>
-      <w:pPr>
-        <w:spacing w:line="360" w:lineRule="auto"/>
-        <w:jc w:val="both"/>
-        <w:rPr>
-          <w:rFonts w:hint="default" w:ascii="Times New Roman" w:hAnsi="Times New Roman" w:cs="Times New Roman"/>
-          <w:b/>
-          <w:bCs/>
-          <w:sz w:val="24"/>
-          <w:szCs w:val="24"/>
-        </w:rPr>
-      </w:pPr>
-      <w:r>
-        <w:rPr>
-          <w:rFonts w:hint="default" w:ascii="Times New Roman" w:hAnsi="Times New Roman" w:cs="Times New Roman"/>
-          <w:b/>
-          <w:bCs/>
-          <w:sz w:val="24"/>
-          <w:szCs w:val="24"/>
-        </w:rPr>
-        <w:t>7. Taxonomy Maintenance and Versioning</w:t>
-      </w:r>
-    </w:p>
-    <w:p>
-      <w:pPr>
-        <w:spacing w:line="360" w:lineRule="auto"/>
-        <w:jc w:val="both"/>
-        <w:rPr>
-          <w:rFonts w:hint="default" w:ascii="Times New Roman" w:hAnsi="Times New Roman" w:cs="Times New Roman"/>
-          <w:sz w:val="24"/>
-          <w:szCs w:val="24"/>
-        </w:rPr>
-      </w:pPr>
-      <w:r>
-        <w:rPr>
-          <w:rFonts w:hint="default" w:ascii="Times New Roman" w:hAnsi="Times New Roman" w:cs="Times New Roman"/>
-          <w:sz w:val="24"/>
-          <w:szCs w:val="24"/>
-        </w:rPr>
-        <w:t xml:space="preserve">The taxonomy is a maintained classification system rather than a permanently fixed list. Changes should be made when a demonstrably better classification approach is identified, when new priority organisms need to be represented, or when the existing categories no longer describe the AMR resource landscape adequately. Changes should be documented in a new taxonomy version so that the meaning of classifications remains </w:t>
+          <w:sz w:val="24"/>
+          <w:szCs w:val="24"/>
+        </w:rPr>
+      </w:pPr>
+      <w:r>
+        <w:rPr>
+          <w:rFonts w:hint="default" w:ascii="Times New Roman" w:hAnsi="Times New Roman" w:cs="Times New Roman"/>
+          <w:sz w:val="24"/>
+          <w:szCs w:val="24"/>
+        </w:rPr>
+        <w:t xml:space="preserve">The taxonomy is a maintained classification system rather </w:t>
       </w:r>
       <w:bookmarkStart w:id="0" w:name="_GoBack"/>
       <w:bookmarkEnd w:id="0"/>
@@ -2941,7 +3506,7 @@
           <w:sz w:val="24"/>
           <w:szCs w:val="24"/>
         </w:rPr>
-        <w:t>traceable.</w:t>
+        <w:t>than a permanently fixed list. Changes should be made when a demonstrably better classification approach is identified, when new priority organisms need to be represented, or when the existing categories no longer describe the AMR resource landscape adequately. Changes should be documented in a new taxonomy version so that the meaning of classifications remains traceable.</w:t>
       </w:r>
     </w:p>
     <w:p>
@@ -3286,26 +3851,6 @@
     </w:lvl>
   </w:abstractNum>
   <w:abstractNum w:abstractNumId="12">
-    <w:nsid w:val="5B9AE1E5"/>
-    <w:multiLevelType w:val="singleLevel"/>
-    <w:tmpl w:val="5B9AE1E5"/>
-    <w:lvl w:ilvl="0" w:tentative="0">
-      <w:start w:val="1"/>
-      <w:numFmt w:val="lowerRoman"/>
-      <w:lvlText w:val="%1."/>
-      <w:lvlJc w:val="left"/>
-      <w:pPr>
-        <w:tabs>
-          <w:tab w:val="left" w:pos="425"/>
-        </w:tabs>
-        <w:ind w:left="425" w:leftChars="0" w:hanging="425" w:firstLineChars="0"/>
-      </w:pPr>
-      <w:rPr>
-        <w:rFonts w:hint="default"/>
-      </w:rPr>
-    </w:lvl>
-  </w:abstractNum>
-  <w:abstractNum w:abstractNumId="13">
     <w:nsid w:val="7092AE38"/>
     <w:multiLevelType w:val="singleLevel"/>
     <w:tmpl w:val="7092AE38"/>
@@ -3356,15 +3901,12 @@
     <w:abstractNumId w:val="12"/>
   </w:num>
   <w:num w:numId="11">
-    <w:abstractNumId w:val="13"/>
+    <w:abstractNumId w:val="10"/>
   </w:num>
   <w:num w:numId="12">
-    <w:abstractNumId w:val="10"/>
+    <w:abstractNumId w:val="1"/>
   </w:num>
   <w:num w:numId="13">
-    <w:abstractNumId w:val="1"/>
-  </w:num>
-  <w:num w:numId="14">
     <w:abstractNumId w:val="2"/>
   </w:num>
 </w:numbering>
@@ -3375,7 +3917,7 @@
   <w:docDefaults>
     <w:rPrDefault>
       <w:rPr>
-        <w:rFonts w:asciiTheme="minorHAnsi" w:hAnsiTheme="minorHAnsi" w:eastAsiaTheme="minorEastAsia" w:cstheme="minorBidi"/>
+        <w:rFonts w:ascii="Times New Roman" w:hAnsi="Times New Roman" w:eastAsia="SimSun" w:cs="Times New Roman"/>
       </w:rPr>
     </w:rPrDefault>
     <w:pPrDefault/>
@@ -3428,7 +3970,7 @@
     <w:lsdException w:uiPriority="99" w:name="table of authorities"/>
     <w:lsdException w:qFormat="1" w:uiPriority="99" w:semiHidden="0" w:name="macro"/>
     <w:lsdException w:uiPriority="99" w:name="toa heading"/>
-    <w:lsdException w:uiPriority="99" w:semiHidden="0" w:name="List"/>
+    <w:lsdException w:qFormat="1" w:uiPriority="99" w:semiHidden="0" w:name="List"/>
     <w:lsdException w:qFormat="1" w:uiPriority="99" w:semiHidden="0" w:name="List Bullet"/>
     <w:lsdException w:qFormat="1" w:uiPriority="99" w:semiHidden="0" w:name="List Number"/>
     <w:lsdException w:qFormat="1" w:uiPriority="99" w:semiHidden="0" w:name="List 2"/>
@@ -3447,7 +3989,7 @@
     <w:lsdException w:uiPriority="99" w:name="Closing"/>
     <w:lsdException w:uiPriority="99" w:name="Signature"/>
     <w:lsdException w:qFormat="1" w:uiPriority="1" w:name="Default Paragraph Font"/>
-    <w:lsdException w:uiPriority="99" w:semiHidden="0" w:name="Body Text"/>
+    <w:lsdException w:qFormat="1" w:uiPriority="99" w:semiHidden="0" w:name="Body Text"/>
     <w:lsdException w:uiPriority="99" w:name="Body Text Indent"/>
     <w:lsdException w:qFormat="1" w:uiPriority="99" w:semiHidden="0" w:name="List Continue"/>
     <w:lsdException w:qFormat="1" w:uiPriority="99" w:semiHidden="0" w:name="List Continue 2"/>
@@ -3461,7 +4003,7 @@
     <w:lsdException w:uiPriority="99" w:name="Body Text First Indent"/>
     <w:lsdException w:uiPriority="99" w:name="Body Text First Indent 2"/>
     <w:lsdException w:uiPriority="99" w:name="Note Heading"/>
-    <w:lsdException w:uiPriority="99" w:semiHidden="0" w:name="Body Text 2"/>
+    <w:lsdException w:qFormat="1" w:uiPriority="99" w:semiHidden="0" w:name="Body Text 2"/>
     <w:lsdException w:qFormat="1" w:uiPriority="99" w:semiHidden="0" w:name="Body Text 3"/>
     <w:lsdException w:uiPriority="99" w:name="Body Text Indent 2"/>
     <w:lsdException w:uiPriority="99" w:name="Body Text Indent 3"/>
@@ -3911,6 +4453,7 @@
     <w:basedOn w:val="1"/>
     <w:link w:val="144"/>
     <w:unhideWhenUsed/>
+    <w:qFormat/>
     <w:uiPriority w:val="99"/>
     <w:pPr>
       <w:spacing w:after="120"/>
@@ -3921,6 +4464,7 @@
     <w:basedOn w:val="1"/>
     <w:link w:val="145"/>
     <w:unhideWhenUsed/>
+    <w:qFormat/>
     <w:uiPriority w:val="99"/>
     <w:pPr>
       <w:spacing w:after="120" w:line="480" w:lineRule="auto"/>
@@ -4009,6 +4553,7 @@
     <w:name w:val="List"/>
     <w:basedOn w:val="1"/>
     <w:unhideWhenUsed/>
+    <w:qFormat/>
     <w:uiPriority w:val="99"/>
     <w:pPr>
       <w:ind w:left="360" w:hanging="360"/>

</xml_diff>